<commit_message>
Removendo solicitação do formulario de geração de parecer técnico
</commit_message>
<xml_diff>
--- a/dados/modelo_parecer_deferido_qh.docx
+++ b/dados/modelo_parecer_deferido_qh.docx
@@ -135,15 +135,7 @@
               <w:rPr>
                 <w:rFonts w:ascii="Times New Roman" w:hAnsi="Times New Roman" w:cs="Times New Roman"/>
               </w:rPr>
-              <w:t xml:space="preserve"> {{PROCESSO}}</w:t>
-            </w:r>
-            <w:bookmarkStart w:id="0" w:name="_GoBack"/>
-            <w:bookmarkEnd w:id="0"/>
-            <w:r>
-              <w:rPr>
-                <w:rFonts w:ascii="Times New Roman" w:hAnsi="Times New Roman" w:cs="Times New Roman"/>
-              </w:rPr>
-              <w:t>.</w:t>
+              <w:t xml:space="preserve"> {{PROCESSO}}.</w:t>
             </w:r>
           </w:p>
         </w:tc>
@@ -293,15 +285,7 @@
           <w:sz w:val="24"/>
           <w:szCs w:val="24"/>
         </w:rPr>
-        <w:t>SOLICITACA</w:t>
-      </w:r>
-      <w:r>
-        <w:rPr>
-          <w:rFonts w:ascii="Times New Roman" w:hAnsi="Times New Roman" w:cs="Times New Roman"/>
-          <w:sz w:val="24"/>
-          <w:szCs w:val="24"/>
-        </w:rPr>
-        <w:t>O</w:t>
+        <w:t>ASSUNTO</w:t>
       </w:r>
       <w:r>
         <w:rPr>
@@ -427,6 +411,8 @@
           <w:szCs w:val="24"/>
         </w:rPr>
       </w:pPr>
+      <w:bookmarkStart w:id="0" w:name="_GoBack"/>
+      <w:bookmarkEnd w:id="0"/>
     </w:p>
     <w:p>
       <w:pPr>

</xml_diff>

<commit_message>
Atualização dos modelos DOCX e refinamento final na listagem de relatórios do Quadro de Horário
</commit_message>
<xml_diff>
--- a/dados/modelo_parecer_deferido_qh.docx
+++ b/dados/modelo_parecer_deferido_qh.docx
@@ -61,12 +61,16 @@
               <w:rPr>
                 <w:rFonts w:ascii="Times New Roman" w:hAnsi="Times New Roman" w:cs="Times New Roman"/>
                 <w:b/>
+                <w:sz w:val="24"/>
+                <w:szCs w:val="24"/>
               </w:rPr>
               <w:t>PARECER TÉCNICO:</w:t>
             </w:r>
             <w:r>
               <w:rPr>
                 <w:rFonts w:ascii="Times New Roman" w:hAnsi="Times New Roman" w:cs="Times New Roman"/>
+                <w:sz w:val="24"/>
+                <w:szCs w:val="24"/>
               </w:rPr>
               <w:t xml:space="preserve"> {{NUM_PARECER}}.</w:t>
             </w:r>
@@ -75,13 +79,24 @@
                 <w:rFonts w:ascii="Times New Roman" w:hAnsi="Times New Roman" w:cs="Times New Roman"/>
               </w:rPr>
               <w:tab/>
+            </w:r>
+            <w:r>
+              <w:rPr>
+                <w:rFonts w:ascii="Times New Roman" w:hAnsi="Times New Roman" w:cs="Times New Roman"/>
+              </w:rPr>
               <w:t xml:space="preserve">           </w:t>
             </w:r>
             <w:r>
               <w:rPr>
                 <w:rFonts w:ascii="Times New Roman" w:hAnsi="Times New Roman" w:cs="Times New Roman"/>
               </w:rPr>
-              <w:t xml:space="preserve">              </w:t>
+              <w:t xml:space="preserve">            </w:t>
+            </w:r>
+            <w:r>
+              <w:rPr>
+                <w:rFonts w:ascii="Times New Roman" w:hAnsi="Times New Roman" w:cs="Times New Roman"/>
+              </w:rPr>
+              <w:t xml:space="preserve"> </w:t>
             </w:r>
             <w:r>
               <w:rPr>
@@ -93,12 +108,16 @@
               <w:rPr>
                 <w:rFonts w:ascii="Times New Roman" w:hAnsi="Times New Roman" w:cs="Times New Roman"/>
                 <w:b/>
+                <w:sz w:val="24"/>
+                <w:szCs w:val="24"/>
               </w:rPr>
               <w:t>DATA:</w:t>
             </w:r>
             <w:r>
               <w:rPr>
                 <w:rFonts w:ascii="Times New Roman" w:hAnsi="Times New Roman" w:cs="Times New Roman"/>
+                <w:sz w:val="24"/>
+                <w:szCs w:val="24"/>
               </w:rPr>
               <w:tab/>
               <w:t>{{DATA}}.</w:t>
@@ -122,18 +141,24 @@
               <w:ind w:right="1618"/>
               <w:rPr>
                 <w:rFonts w:ascii="Times New Roman" w:hAnsi="Times New Roman" w:cs="Times New Roman"/>
+                <w:sz w:val="24"/>
+                <w:szCs w:val="24"/>
               </w:rPr>
             </w:pPr>
             <w:r>
               <w:rPr>
                 <w:rFonts w:ascii="Times New Roman" w:hAnsi="Times New Roman" w:cs="Times New Roman"/>
                 <w:b/>
+                <w:sz w:val="24"/>
+                <w:szCs w:val="24"/>
               </w:rPr>
               <w:t>PROCESSO:</w:t>
             </w:r>
             <w:r>
               <w:rPr>
                 <w:rFonts w:ascii="Times New Roman" w:hAnsi="Times New Roman" w:cs="Times New Roman"/>
+                <w:sz w:val="24"/>
+                <w:szCs w:val="24"/>
               </w:rPr>
               <w:t xml:space="preserve"> {{PROCESSO}}.</w:t>
             </w:r>
@@ -151,12 +176,16 @@
               <w:ind w:right="1671"/>
               <w:rPr>
                 <w:rFonts w:ascii="Times New Roman" w:hAnsi="Times New Roman" w:cs="Times New Roman"/>
+                <w:sz w:val="24"/>
+                <w:szCs w:val="24"/>
               </w:rPr>
             </w:pPr>
             <w:r>
               <w:rPr>
                 <w:rFonts w:ascii="Times New Roman" w:hAnsi="Times New Roman" w:cs="Times New Roman"/>
                 <w:b/>
+                <w:sz w:val="24"/>
+                <w:szCs w:val="24"/>
               </w:rPr>
               <w:t>ASSUNTO:</w:t>
             </w:r>
@@ -164,12 +193,16 @@
               <w:rPr>
                 <w:rFonts w:ascii="Times New Roman" w:hAnsi="Times New Roman" w:cs="Times New Roman"/>
                 <w:spacing w:val="39"/>
+                <w:sz w:val="24"/>
+                <w:szCs w:val="24"/>
               </w:rPr>
               <w:t xml:space="preserve"> </w:t>
             </w:r>
             <w:r>
               <w:rPr>
                 <w:rFonts w:ascii="Times New Roman" w:hAnsi="Times New Roman" w:cs="Times New Roman"/>
+                <w:sz w:val="24"/>
+                <w:szCs w:val="24"/>
               </w:rPr>
               <w:t xml:space="preserve">{{ASSUNTO}}. </w:t>
             </w:r>
@@ -193,6 +226,8 @@
               <w:rPr>
                 <w:rFonts w:ascii="Times New Roman" w:hAnsi="Times New Roman" w:cs="Times New Roman"/>
                 <w:b/>
+                <w:sz w:val="24"/>
+                <w:szCs w:val="24"/>
               </w:rPr>
               <w:t>SOLICITANTE:</w:t>
             </w:r>
@@ -200,7 +235,21 @@
               <w:rPr>
                 <w:rFonts w:ascii="Times New Roman" w:hAnsi="Times New Roman" w:cs="Times New Roman"/>
               </w:rPr>
-              <w:t xml:space="preserve"> {{SOLICITANTE}}. </w:t>
+              <w:t xml:space="preserve"> </w:t>
+            </w:r>
+            <w:r>
+              <w:rPr>
+                <w:rFonts w:ascii="Times New Roman" w:hAnsi="Times New Roman" w:cs="Times New Roman"/>
+                <w:sz w:val="24"/>
+                <w:szCs w:val="24"/>
+              </w:rPr>
+              <w:t>{{SOLICITANTE}}.</w:t>
+            </w:r>
+            <w:r>
+              <w:rPr>
+                <w:rFonts w:ascii="Times New Roman" w:hAnsi="Times New Roman" w:cs="Times New Roman"/>
+              </w:rPr>
+              <w:t xml:space="preserve"> </w:t>
             </w:r>
           </w:p>
         </w:tc>
@@ -245,23 +294,7 @@
           <w:sz w:val="24"/>
           <w:szCs w:val="24"/>
         </w:rPr>
-        <w:t>Em resp</w:t>
-      </w:r>
-      <w:r>
-        <w:rPr>
-          <w:rFonts w:ascii="Times New Roman" w:hAnsi="Times New Roman" w:cs="Times New Roman"/>
-          <w:sz w:val="24"/>
-          <w:szCs w:val="24"/>
-        </w:rPr>
-        <w:t xml:space="preserve">osta ao processo supracitado, o </w:t>
-      </w:r>
-      <w:r>
-        <w:rPr>
-          <w:rFonts w:ascii="Times New Roman" w:hAnsi="Times New Roman" w:cs="Times New Roman"/>
-          <w:sz w:val="24"/>
-          <w:szCs w:val="24"/>
-        </w:rPr>
-        <w:t>qual solicita</w:t>
+        <w:t>Em resposta ao processo supracitado, o qual solicita</w:t>
       </w:r>
       <w:r>
         <w:rPr>
@@ -277,39 +310,7 @@
           <w:sz w:val="24"/>
           <w:szCs w:val="24"/>
         </w:rPr>
-        <w:t>{{</w:t>
-      </w:r>
-      <w:r>
-        <w:rPr>
-          <w:rFonts w:ascii="Times New Roman" w:hAnsi="Times New Roman" w:cs="Times New Roman"/>
-          <w:sz w:val="24"/>
-          <w:szCs w:val="24"/>
-        </w:rPr>
-        <w:t>SOLICITACA</w:t>
-      </w:r>
-      <w:r>
-        <w:rPr>
-          <w:rFonts w:ascii="Times New Roman" w:hAnsi="Times New Roman" w:cs="Times New Roman"/>
-          <w:sz w:val="24"/>
-          <w:szCs w:val="24"/>
-        </w:rPr>
-        <w:t>O</w:t>
-      </w:r>
-      <w:r>
-        <w:rPr>
-          <w:rFonts w:ascii="Times New Roman" w:hAnsi="Times New Roman" w:cs="Times New Roman"/>
-          <w:sz w:val="24"/>
-          <w:szCs w:val="24"/>
-        </w:rPr>
-        <w:t>}}</w:t>
-      </w:r>
-      <w:r>
-        <w:rPr>
-          <w:rFonts w:ascii="Times New Roman" w:hAnsi="Times New Roman" w:cs="Times New Roman"/>
-          <w:sz w:val="24"/>
-          <w:szCs w:val="24"/>
-        </w:rPr>
-        <w:t xml:space="preserve">, </w:t>
+        <w:t xml:space="preserve">{{ASSUNTO}}, </w:t>
       </w:r>
       <w:r>
         <w:rPr>
@@ -349,47 +350,7 @@
           <w:sz w:val="24"/>
           <w:szCs w:val="24"/>
         </w:rPr>
-        <w:t xml:space="preserve"> Informamos que </w:t>
-      </w:r>
-      <w:r>
-        <w:rPr>
-          <w:rFonts w:ascii="Times New Roman" w:hAnsi="Times New Roman" w:cs="Times New Roman"/>
-          <w:sz w:val="24"/>
-          <w:szCs w:val="24"/>
-        </w:rPr>
-        <w:t xml:space="preserve">conforme os parâmetros operacionais vigentes do Sistema de </w:t>
-      </w:r>
-      <w:r>
-        <w:rPr>
-          <w:rFonts w:ascii="Times New Roman" w:hAnsi="Times New Roman" w:cs="Times New Roman"/>
-          <w:sz w:val="24"/>
-          <w:szCs w:val="24"/>
-        </w:rPr>
-        <w:t>Transporte Público de Fortaleza, foi realizado</w:t>
-      </w:r>
-      <w:r>
-        <w:rPr>
-          <w:rFonts w:ascii="Times New Roman" w:hAnsi="Times New Roman" w:cs="Times New Roman"/>
-          <w:sz w:val="24"/>
-          <w:szCs w:val="24"/>
-        </w:rPr>
-        <w:t xml:space="preserve"> análise técnica das informações operacionais</w:t>
-      </w:r>
-      <w:r>
-        <w:rPr>
-          <w:rFonts w:ascii="Times New Roman" w:hAnsi="Times New Roman" w:cs="Times New Roman"/>
-          <w:sz w:val="24"/>
-          <w:szCs w:val="24"/>
-        </w:rPr>
-        <w:t xml:space="preserve"> e da disponibilidade de frota</w:t>
-      </w:r>
-      <w:r>
-        <w:rPr>
-          <w:rFonts w:ascii="Times New Roman" w:hAnsi="Times New Roman" w:cs="Times New Roman"/>
-          <w:sz w:val="24"/>
-          <w:szCs w:val="24"/>
-        </w:rPr>
-        <w:t>.</w:t>
+        <w:t xml:space="preserve"> Informamos que conforme os parâmetros operacionais vigentes do Sistema de Transporte Público de Fortaleza, foi realizado análise técnica das informações operacionais e da disponibilidade de frota.</w:t>
       </w:r>
     </w:p>
     <w:p>
@@ -412,25 +373,7 @@
           <w:szCs w:val="24"/>
           <w:lang w:eastAsia="ar-SA"/>
         </w:rPr>
-        <w:t>Diante do exposto, constatou-se que existe indic</w:t>
-      </w:r>
-      <w:r>
-        <w:rPr>
-          <w:rFonts w:ascii="Times New Roman" w:eastAsia="Times New Roman" w:hAnsi="Times New Roman" w:cs="Times New Roman"/>
-          <w:sz w:val="24"/>
-          <w:szCs w:val="24"/>
-          <w:lang w:eastAsia="ar-SA"/>
-        </w:rPr>
-        <w:t xml:space="preserve">ação técnica para atendimento à </w:t>
-      </w:r>
-      <w:r>
-        <w:rPr>
-          <w:rFonts w:ascii="Times New Roman" w:eastAsia="Times New Roman" w:hAnsi="Times New Roman" w:cs="Times New Roman"/>
-          <w:sz w:val="24"/>
-          <w:szCs w:val="24"/>
-          <w:lang w:eastAsia="ar-SA"/>
-        </w:rPr>
-        <w:t>solicitação.</w:t>
+        <w:t>Diante do exposto, constatou-se que existe indicação técnica para atendimento à solicitação.</w:t>
       </w:r>
     </w:p>
     <w:p>
@@ -464,8 +407,6 @@
           <w:szCs w:val="24"/>
         </w:rPr>
       </w:pPr>
-      <w:bookmarkStart w:id="0" w:name="_GoBack"/>
-      <w:bookmarkEnd w:id="0"/>
     </w:p>
     <w:p>
       <w:pPr>
@@ -682,6 +623,14 @@
           <w:rFonts w:ascii="Times New Roman" w:hAnsi="Times New Roman" w:cs="Times New Roman"/>
         </w:rPr>
       </w:pPr>
+      <w:r>
+        <w:rPr>
+          <w:rFonts w:ascii="Times New Roman" w:hAnsi="Times New Roman" w:cs="Times New Roman"/>
+        </w:rPr>
+        <w:t xml:space="preserve"> </w:t>
+      </w:r>
+      <w:bookmarkStart w:id="0" w:name="_GoBack"/>
+      <w:bookmarkEnd w:id="0"/>
       <w:r>
         <w:rPr>
           <w:rFonts w:ascii="Times New Roman" w:hAnsi="Times New Roman" w:cs="Times New Roman"/>

</xml_diff>